<commit_message>
v5.1.0: Wandeldarlehen-Testakte komplett ueberarbeitet
- Vollwertige bilinguale DE/EN Wandeldarlehen-Vertragsfassung (11 Paragraphen, Mustervorlage)
- Einsprachige deutsche Vertragsfassung passend dazu
- Neues Term-Sheet (24 Parameter, 15. April 2026) als Vor-Vertragsphase
- Neue Wandlungsmitteilung der Gesellschaft an den Investor
- Wandlungserklaerung, Gesellschafterbeschluss, Notar-Paket aufpoliert
- Cap-Tables Pre-/Post-Money sauber neu geschrieben (1.000 Anteile, ohne Treasury, mit Verwaesserungs-Check)
- MD-Konvertierung mit Bilingual-Pattern fuer lesbare GitHub-Vorschauen
- XLSX-Vorschauen mit Prozent-Format, Tausender-Trenner, Title-Bloecken
- 275 .md-Vorschauen im gesamten Repo neu generiert
- Testakten- und Plugin-Readme aktualisiert
</commit_message>
<xml_diff>
--- a/testakten/wandeldarlehen-beispielcase/Gesellschafterbeschluss-Kapitalerhoehung-Muster.docx
+++ b/testakten/wandeldarlehen-beispielcase/Gesellschafterbeschluss-Kapitalerhoehung-Muster.docx
@@ -8,12 +8,10 @@
       </w:pPr>
       <w:r>
         <w:rPr>
-          <w:rFonts w:ascii="Calibri" w:hAnsi="Calibri"/>
           <w:b/>
-          <w:color w:val="1B474D"/>
-          <w:sz w:val="36"/>
+          <w:sz w:val="28"/>
         </w:rPr>
-        <w:t>GESELLSCHAFTERBESCHLUSS</w:t>
+        <w:t>PROTOKOLL ÜBER DIE GESELLSCHAFTERVERSAMMLUNG</w:t>
       </w:r>
     </w:p>
     <w:p>
@@ -22,12 +20,10 @@
       </w:pPr>
       <w:r>
         <w:rPr>
-          <w:rFonts w:ascii="Calibri" w:hAnsi="Calibri"/>
           <w:b/>
-          <w:color w:val="20808D"/>
           <w:sz w:val="24"/>
         </w:rPr>
-        <w:t>Kapitalerhoehung aus Wandlung des Wandeldarlehens</w:t>
+        <w:t>Sonnenglas Solartechnologie UG (haftungsbeschränkt)</w:t>
       </w:r>
     </w:p>
     <w:p>
@@ -36,547 +32,364 @@
       </w:pPr>
       <w:r>
         <w:rPr>
-          <w:rFonts w:ascii="Calibri" w:hAnsi="Calibri"/>
           <w:i/>
-          <w:color w:val="7A7974"/>
           <w:sz w:val="20"/>
         </w:rPr>
-        <w:t>(Muster - beurkundungspflichtig gemaess SS 55 GmbHG i.V.m. SS 2 GmbHG)</w:t>
+        <w:t>mit Beschlussfassung über Kapitalerhöhung gemäß § 55 GmbHG</w:t>
+      </w:r>
+    </w:p>
+    <w:p/>
+    <w:p>
+      <w:r>
+        <w:rPr>
+          <w:b/>
+          <w:sz w:val="22"/>
+        </w:rPr>
+        <w:t>I. Eckdaten der Versammlung</w:t>
+      </w:r>
+    </w:p>
+    <w:p>
+      <w:pPr>
+        <w:spacing w:after="40"/>
+      </w:pPr>
+      <w:r>
+        <w:t>Datum, Uhrzeit: Donnerstag, 4. März 2027, 10:00 Uhr MEZ</w:t>
+      </w:r>
+    </w:p>
+    <w:p>
+      <w:pPr>
+        <w:spacing w:after="40"/>
+      </w:pPr>
+      <w:r>
+        <w:t>Ort: Geschäftsräume der Notarin Dr. Eva Wendthusen, Charlottenstraße 65, 10117 Berlin</w:t>
+      </w:r>
+    </w:p>
+    <w:p>
+      <w:pPr>
+        <w:spacing w:after="40"/>
+      </w:pPr>
+      <w:r>
+        <w:t>Notarielle Begleitung: Notarin Dr. Eva Wendthusen, UR-Nr. 0142/2027</w:t>
+      </w:r>
+    </w:p>
+    <w:p>
+      <w:pPr>
+        <w:spacing w:after="40"/>
+      </w:pPr>
+      <w:r>
+        <w:t>Art der Versammlung: außerordentliche Gesellschafterversammlung, einberufen nach § 9 der Satzung mit Frist von zwei Wochen unter Angabe der Tagesordnung. Auf eine längere Frist haben alle Gesellschafterinnen verzichtet (Anwesenheitsverzicht).</w:t>
+      </w:r>
+    </w:p>
+    <w:p/>
+    <w:p>
+      <w:r>
+        <w:rPr>
+          <w:b/>
+          <w:sz w:val="22"/>
+        </w:rPr>
+        <w:t>II. Anwesenheit</w:t>
+      </w:r>
+    </w:p>
+    <w:p>
+      <w:pPr>
+        <w:spacing w:after="40"/>
+      </w:pPr>
+      <w:r>
+        <w:t>(1) Dr. Mira Schoeneck – 600 Geschäftsanteile (60,00 %), in eigener Person</w:t>
+      </w:r>
+    </w:p>
+    <w:p>
+      <w:pPr>
+        <w:spacing w:after="40"/>
+      </w:pPr>
+      <w:r>
+        <w:t>(2) Lina Habersaat – 400 Geschäftsanteile (40,00 %), in eigener Person</w:t>
+      </w:r>
+    </w:p>
+    <w:p>
+      <w:pPr>
+        <w:spacing w:after="40"/>
+      </w:pPr>
+      <w:r>
+        <w:t>Anwesendes Stammkapital: EUR 1.000 (100,00 %). Die Versammlung ist beschlussfähig.</w:t>
+      </w:r>
+    </w:p>
+    <w:p>
+      <w:pPr>
+        <w:spacing w:after="40"/>
+      </w:pPr>
+      <w:r>
+        <w:t>Als Gast nimmt für den Darlehensgeber Northstar Pre-Seed Partners GmbH &amp; Co. KG Herr Henrik Brendelmann teil.</w:t>
+      </w:r>
+    </w:p>
+    <w:p/>
+    <w:p>
+      <w:r>
+        <w:rPr>
+          <w:b/>
+          <w:sz w:val="22"/>
+        </w:rPr>
+        <w:t>III. Tagesordnung</w:t>
+      </w:r>
+    </w:p>
+    <w:p>
+      <w:pPr>
+        <w:spacing w:after="40"/>
+      </w:pPr>
+      <w:r>
+        <w:t>TOP 1: Bericht der Geschäftsführerin zur Wandlungserklärung der Northstar Pre-Seed Partners vom 22. Februar 2027 und zur geplanten Seed-Runde 2027.</w:t>
+      </w:r>
+    </w:p>
+    <w:p>
+      <w:pPr>
+        <w:spacing w:after="40"/>
+      </w:pPr>
+      <w:r>
+        <w:t>TOP 2: Beschlussfassung über Kapitalerhöhung um EUR 66 von EUR 1.000 auf EUR 1.066 durch Ausgabe von 66 neuen Geschäftsanteilen mit einem Nennbetrag von je EUR 1,00.</w:t>
+      </w:r>
+    </w:p>
+    <w:p>
+      <w:pPr>
+        <w:spacing w:after="40"/>
+      </w:pPr>
+      <w:r>
+        <w:t>TOP 3: Zulassung der Northstar Pre-Seed Partners GmbH &amp; Co. KG zur Übernahme der neuen Geschäftsanteile.</w:t>
+      </w:r>
+    </w:p>
+    <w:p>
+      <w:pPr>
+        <w:spacing w:after="40"/>
+      </w:pPr>
+      <w:r>
+        <w:t>TOP 4: Bezugsrechtsverzicht der Gesellschafterinnen.</w:t>
+      </w:r>
+    </w:p>
+    <w:p>
+      <w:pPr>
+        <w:spacing w:after="40"/>
+      </w:pPr>
+      <w:r>
+        <w:t>TOP 5: Satzungsänderung in § 3 (Stammkapital) entsprechend der Kapitalerhöhung.</w:t>
+      </w:r>
+    </w:p>
+    <w:p>
+      <w:pPr>
+        <w:spacing w:after="40"/>
+      </w:pPr>
+      <w:r>
+        <w:t>TOP 6: Beschluss über die Einlage des Differenzbetrages zwischen Wandlungssumme und Nennbetrag in die Kapitalrücklage gemäß § 272 Abs. 2 Nr. 4 HGB.</w:t>
+      </w:r>
+    </w:p>
+    <w:p>
+      <w:pPr>
+        <w:spacing w:after="40"/>
+      </w:pPr>
+      <w:r>
+        <w:t>TOP 7: Sonstiges.</w:t>
+      </w:r>
+    </w:p>
+    <w:p/>
+    <w:p>
+      <w:r>
+        <w:rPr>
+          <w:b/>
+          <w:sz w:val="22"/>
+        </w:rPr>
+        <w:t>IV. Beschlüsse</w:t>
+      </w:r>
+    </w:p>
+    <w:p>
+      <w:pPr>
+        <w:spacing w:after="40"/>
+      </w:pPr>
+      <w:r>
+        <w:t>Zu TOP 2 (Kapitalerhöhung):</w:t>
+      </w:r>
+    </w:p>
+    <w:p>
+      <w:pPr>
+        <w:spacing w:after="40"/>
+      </w:pPr>
+      <w:r>
+        <w:t>Die Gesellschafterversammlung beschließt einstimmig, das Stammkapital der Gesellschaft um EUR 66 (in Worten: sechsundsechzig Euro) von EUR 1.000 (eintausend Euro) auf EUR 1.066 (eintausendsechsundsechzig Euro) zu erhöhen durch Ausgabe von 66 neuen Geschäftsanteilen Nr. 1.001 bis Nr. 1.066 mit einem Nennbetrag von je EUR 1,00.</w:t>
       </w:r>
     </w:p>
     <w:p/>
     <w:p>
       <w:pPr>
         <w:spacing w:after="40"/>
-        <w:pBdr>
-          <w:bottom w:val="single" w:sz="6" w:space="1" w:color="D4D1CA"/>
-        </w:pBdr>
       </w:pPr>
-    </w:p>
-    <w:p/>
-    <w:p>
       <w:r>
-        <w:rPr>
-          <w:rFonts w:ascii="Calibri" w:hAnsi="Calibri"/>
-          <w:b/>
-          <w:color w:val="1B474D"/>
-          <w:sz w:val="24"/>
-        </w:rPr>
-        <w:t>Gesellschaft</w:t>
+        <w:t>Zu TOP 3 (Zulassung):</w:t>
       </w:r>
     </w:p>
     <w:p>
+      <w:pPr>
+        <w:spacing w:after="40"/>
+      </w:pPr>
       <w:r>
-        <w:rPr>
-          <w:rFonts w:ascii="Calibri" w:hAnsi="Calibri"/>
-          <w:b/>
-          <w:color w:val="28251D"/>
-          <w:sz w:val="22"/>
-        </w:rPr>
-        <w:t xml:space="preserve">Firma: </w:t>
-      </w:r>
-      <w:r>
-        <w:rPr>
-          <w:rFonts w:ascii="Calibri" w:hAnsi="Calibri"/>
-          <w:color w:val="28251D"/>
-          <w:sz w:val="22"/>
-        </w:rPr>
-        <w:t>Sonnenglas Solartechnologie UG (haftungsbeschraenkt)</w:t>
-      </w:r>
-    </w:p>
-    <w:p>
-      <w:r>
-        <w:rPr>
-          <w:rFonts w:ascii="Calibri" w:hAnsi="Calibri"/>
-          <w:b/>
-          <w:color w:val="28251D"/>
-          <w:sz w:val="22"/>
-        </w:rPr>
-        <w:t xml:space="preserve">Sitz: </w:t>
-      </w:r>
-      <w:r>
-        <w:rPr>
-          <w:rFonts w:ascii="Calibri" w:hAnsi="Calibri"/>
-          <w:color w:val="28251D"/>
-          <w:sz w:val="22"/>
-        </w:rPr>
-        <w:t>Berlin</w:t>
-      </w:r>
-    </w:p>
-    <w:p>
-      <w:r>
-        <w:rPr>
-          <w:rFonts w:ascii="Calibri" w:hAnsi="Calibri"/>
-          <w:b/>
-          <w:color w:val="28251D"/>
-          <w:sz w:val="22"/>
-        </w:rPr>
-        <w:t xml:space="preserve">Amtsgericht: </w:t>
-      </w:r>
-      <w:r>
-        <w:rPr>
-          <w:rFonts w:ascii="Calibri" w:hAnsi="Calibri"/>
-          <w:color w:val="28251D"/>
-          <w:sz w:val="22"/>
-        </w:rPr>
-        <w:t>Charlottenburg, HRB 123456 B</w:t>
-      </w:r>
-    </w:p>
-    <w:p>
-      <w:r>
-        <w:rPr>
-          <w:rFonts w:ascii="Calibri" w:hAnsi="Calibri"/>
-          <w:b/>
-          <w:color w:val="28251D"/>
-          <w:sz w:val="22"/>
-        </w:rPr>
-        <w:t xml:space="preserve">Datum der Versammlung: </w:t>
-      </w:r>
-      <w:r>
-        <w:rPr>
-          <w:rFonts w:ascii="Calibri" w:hAnsi="Calibri"/>
-          <w:color w:val="28251D"/>
-          <w:sz w:val="22"/>
-        </w:rPr>
-        <w:t>[Datum eintragen]</w:t>
-      </w:r>
-    </w:p>
-    <w:p>
-      <w:r>
-        <w:rPr>
-          <w:rFonts w:ascii="Calibri" w:hAnsi="Calibri"/>
-          <w:b/>
-          <w:color w:val="28251D"/>
-          <w:sz w:val="22"/>
-        </w:rPr>
-        <w:t xml:space="preserve">Ort der Beurkundung: </w:t>
-      </w:r>
-      <w:r>
-        <w:rPr>
-          <w:rFonts w:ascii="Calibri" w:hAnsi="Calibri"/>
-          <w:color w:val="28251D"/>
-          <w:sz w:val="22"/>
-        </w:rPr>
-        <w:t>[Notar/Notariat eintragen]</w:t>
+        <w:t>Die Gesellschafterversammlung beschließt einstimmig, die Northstar Pre-Seed Partners GmbH &amp; Co. KG zur Übernahme der neuen Geschäftsanteile Nr. 1.001 bis 1.066 zuzulassen. Übernahmeerklärung wird im unmittelbaren Anschluss zu UR-Nr. 0143/2027 notariell beurkundet.</w:t>
       </w:r>
     </w:p>
     <w:p/>
     <w:p>
       <w:pPr>
         <w:spacing w:after="40"/>
-        <w:pBdr>
-          <w:bottom w:val="single" w:sz="6" w:space="1" w:color="D4D1CA"/>
-        </w:pBdr>
       </w:pPr>
-    </w:p>
-    <w:p>
       <w:r>
-        <w:rPr>
-          <w:rFonts w:ascii="Calibri" w:hAnsi="Calibri"/>
-          <w:b/>
-          <w:color w:val="1B474D"/>
-          <w:sz w:val="24"/>
-        </w:rPr>
-        <w:t>Anwesende Gesellschafter</w:t>
+        <w:t>Zu TOP 4 (Bezugsrechtsverzicht):</w:t>
       </w:r>
     </w:p>
     <w:p>
+      <w:pPr>
+        <w:spacing w:after="40"/>
+      </w:pPr>
       <w:r>
-        <w:rPr>
-          <w:rFonts w:ascii="Calibri" w:hAnsi="Calibri"/>
-          <w:b/>
-          <w:color w:val="28251D"/>
-          <w:sz w:val="22"/>
-        </w:rPr>
-        <w:t xml:space="preserve">Dr. Mira Schoeneck: </w:t>
-      </w:r>
-      <w:r>
-        <w:rPr>
-          <w:rFonts w:ascii="Calibri" w:hAnsi="Calibri"/>
-          <w:color w:val="28251D"/>
-          <w:sz w:val="22"/>
-        </w:rPr>
-        <w:t>40 Anteile (40,00 % des Stammkapitals)</w:t>
-      </w:r>
-    </w:p>
-    <w:p>
-      <w:r>
-        <w:rPr>
-          <w:rFonts w:ascii="Calibri" w:hAnsi="Calibri"/>
-          <w:b/>
-          <w:color w:val="28251D"/>
-          <w:sz w:val="22"/>
-        </w:rPr>
-        <w:t xml:space="preserve">Lina Habersaat: </w:t>
-      </w:r>
-      <w:r>
-        <w:rPr>
-          <w:rFonts w:ascii="Calibri" w:hAnsi="Calibri"/>
-          <w:color w:val="28251D"/>
-          <w:sz w:val="22"/>
-        </w:rPr>
-        <w:t>35 Anteile (35,00 % des Stammkapitals)</w:t>
-      </w:r>
-    </w:p>
-    <w:p>
-      <w:r>
-        <w:rPr>
-          <w:rFonts w:ascii="Calibri" w:hAnsi="Calibri"/>
-          <w:b/>
-          <w:color w:val="28251D"/>
-          <w:sz w:val="22"/>
-        </w:rPr>
-        <w:t xml:space="preserve">Northstar Pre-Seed Partners GmbH &amp; Co. KG: </w:t>
-      </w:r>
-      <w:r>
-        <w:rPr>
-          <w:rFonts w:ascii="Calibri" w:hAnsi="Calibri"/>
-          <w:color w:val="28251D"/>
-          <w:sz w:val="22"/>
-        </w:rPr>
-        <w:t>0 Anteile (Wandlungsglaeubigerin, nimmt teil)</w:t>
-      </w:r>
-    </w:p>
-    <w:p>
-      <w:r>
-        <w:rPr>
-          <w:rFonts w:ascii="Calibri" w:hAnsi="Calibri"/>
-          <w:b w:val="0"/>
-          <w:i/>
-          <w:color w:val="7A7974"/>
-          <w:sz w:val="20"/>
-        </w:rPr>
-        <w:t>Die eigenen Anteile der Gesellschaft (25 Anteile) sind nicht stimmberechtigt (SS 47 Abs. 4 GmbHG).</w:t>
+        <w:t>Dr. Mira Schoeneck und Lina Habersaat verzichten hiermit jeweils ausdrücklich auf ihre Bezugsrechte hinsichtlich der zu schaffenden 66 neuen Geschäftsanteile.</w:t>
       </w:r>
     </w:p>
     <w:p/>
     <w:p>
       <w:pPr>
         <w:spacing w:after="40"/>
-        <w:pBdr>
-          <w:bottom w:val="single" w:sz="6" w:space="1" w:color="D4D1CA"/>
-        </w:pBdr>
       </w:pPr>
-    </w:p>
-    <w:p>
       <w:r>
-        <w:rPr>
-          <w:rFonts w:ascii="Calibri" w:hAnsi="Calibri"/>
-          <w:b/>
-          <w:color w:val="1B474D"/>
-          <w:sz w:val="24"/>
-        </w:rPr>
-        <w:t>Beschluesse</w:t>
+        <w:t>Zu TOP 5 (Satzungsänderung):</w:t>
       </w:r>
     </w:p>
     <w:p>
+      <w:pPr>
+        <w:spacing w:after="40"/>
+      </w:pPr>
       <w:r>
-        <w:rPr>
-          <w:rFonts w:ascii="Calibri" w:hAnsi="Calibri"/>
-          <w:b/>
-          <w:color w:val="20808D"/>
-          <w:sz w:val="24"/>
-        </w:rPr>
-        <w:t>SS 1 - Kapitalerhoehung gegen Sacheinlage (Wandlung)</w:t>
+        <w:t>Die Gesellschafterversammlung beschließt einstimmig die Änderung von § 3 Abs. 1 der Satzung wie folgt:</w:t>
       </w:r>
     </w:p>
     <w:p>
+      <w:pPr>
+        <w:spacing w:after="40"/>
+      </w:pPr>
       <w:r>
-        <w:rPr>
-          <w:rFonts w:ascii="Calibri" w:hAnsi="Calibri"/>
-          <w:b w:val="0"/>
-          <w:i w:val="0"/>
-          <w:color w:val="28251D"/>
-          <w:sz w:val="22"/>
-        </w:rPr>
-        <w:t>Die Gesellschafter beschliessen mit der zur Aenderung des Gesellschaftsvertrags erforderlichen Mehrheit:</w:t>
+        <w:t>„§ 3 Stammkapital. Das Stammkapital der Gesellschaft beträgt EUR 1.066,00 (eintausendsechsundsechzig Euro). Es ist eingeteilt in 1.066 Geschäftsanteile zu je EUR 1,00."</w:t>
+      </w:r>
+    </w:p>
+    <w:p/>
+    <w:p>
+      <w:pPr>
+        <w:spacing w:after="40"/>
+      </w:pPr>
+      <w:r>
+        <w:t>Zu TOP 6 (Kapitalrücklage):</w:t>
+      </w:r>
+    </w:p>
+    <w:p>
+      <w:pPr>
+        <w:spacing w:after="40"/>
+      </w:pPr>
+      <w:r>
+        <w:t>Die Gesellschafterversammlung beschließt einstimmig, dass die Northstar Pre-Seed Partners GmbH &amp; Co. KG den Differenzbetrag zwischen der Wandlungssumme (EUR 261.541,67) und dem Nennbetrag der übernommenen Geschäftsanteile (EUR 66,00), mithin EUR 261.475,67, im Wege der Einlage in die Kapitalrücklage gemäß § 272 Abs. 2 Nr. 4 HGB einbringt. Die hierfür erforderliche Sacheinlage- bzw. Verzichtsvereinbarung wird gesondert beurkundet (vgl. UR-Nr. 0144/2027).</w:t>
+      </w:r>
+    </w:p>
+    <w:p/>
+    <w:p>
+      <w:pPr>
+        <w:spacing w:after="40"/>
+      </w:pPr>
+      <w:r>
+        <w:t>Zu TOP 7 (Sonstiges): keine weiteren Beschlüsse.</w:t>
       </w:r>
     </w:p>
     <w:p/>
     <w:p>
       <w:r>
         <w:rPr>
-          <w:rFonts w:ascii="Calibri" w:hAnsi="Calibri"/>
-          <w:b w:val="0"/>
-          <w:i w:val="0"/>
-          <w:color w:val="28251D"/>
+          <w:b/>
           <w:sz w:val="22"/>
         </w:rPr>
-        <w:t>1. Das Stammkapital der Gesellschaft wird von EUR 1000,00 um EUR 7,00 auf EUR 1007,00 erhoeht (Kapitalerhoehung I - Wandlung Wandeldarlehen Northstar).</w:t>
+        <w:t>V. Schlussfeststellung</w:t>
+      </w:r>
+    </w:p>
+    <w:p>
+      <w:pPr>
+        <w:spacing w:after="40"/>
+      </w:pPr>
+      <w:r>
+        <w:t>Die Versammlung wird um 11:35 Uhr geschlossen. Die Beschlüsse zu TOP 2, 5 und (soweit beurkundungspflichtig) TOP 6 sind in der notariellen Niederschrift gemäß § 53 Abs. 2 GmbHG bzw. § 15 Abs. 4 GmbHG ausgewiesen.</w:t>
       </w:r>
     </w:p>
     <w:p/>
     <w:p>
       <w:r>
         <w:rPr>
-          <w:rFonts w:ascii="Calibri" w:hAnsi="Calibri"/>
-          <w:b w:val="0"/>
-          <w:i w:val="0"/>
-          <w:color w:val="28251D"/>
+          <w:b/>
           <w:sz w:val="22"/>
         </w:rPr>
-        <w:t>2. Die Kapitalerhoehung erfolgt durch Ausgabe von sieben (7) neuen Geschaeftsanteilen im Nennbetrag von je EUR 1,00 (lfd. Nrn. [bitte eintragen]).</w:t>
-      </w:r>
-    </w:p>
-    <w:p/>
-    <w:p>
-      <w:r>
-        <w:rPr>
-          <w:rFonts w:ascii="Calibri" w:hAnsi="Calibri"/>
-          <w:b w:val="0"/>
-          <w:i w:val="0"/>
-          <w:color w:val="28251D"/>
-          <w:sz w:val="22"/>
-        </w:rPr>
-        <w:t>3. Die neuen Geschaeftsanteile werden von Northstar Pre-Seed Partners GmbH &amp; Co. KG uebernommen.</w:t>
-      </w:r>
-    </w:p>
-    <w:p/>
-    <w:p>
-      <w:r>
-        <w:rPr>
-          <w:rFonts w:ascii="Calibri" w:hAnsi="Calibri"/>
-          <w:b w:val="0"/>
-          <w:i w:val="0"/>
-          <w:color w:val="28251D"/>
-          <w:sz w:val="22"/>
-        </w:rPr>
-        <w:t>4. Die Einlage wird durch Sacheinlage erbracht: Die Wandlungsglaeubigerin bringt ihre Darlehensforderung zuzueglich Zinsen in Hoehe von insgesamt EUR 275694 gegen die Gesellschaft im Wege der Forderungseinlage ein. Der EUR 7,00 uebersteigende Betrag (EUR 275687) wird in die Kapitalruecklage gemaess SS 272 Abs. 2 Nr. 1 HGB eingestellt.</w:t>
-      </w:r>
-    </w:p>
-    <w:p/>
-    <w:p>
-      <w:r>
-        <w:rPr>
-          <w:rFonts w:ascii="Calibri" w:hAnsi="Calibri"/>
-          <w:b w:val="0"/>
-          <w:i w:val="0"/>
-          <w:color w:val="28251D"/>
-          <w:sz w:val="22"/>
-        </w:rPr>
-        <w:t>5. Die Gesellschaft ist bevollmaechtigt, nach Eintragung der Kapitalerhoehung im Handelsregister die aktualisierte Gesellschafterliste gemaess SS 40 GmbHG einzureichen.</w:t>
-      </w:r>
-    </w:p>
-    <w:p/>
-    <w:p>
-      <w:r>
-        <w:rPr>
-          <w:rFonts w:ascii="Calibri" w:hAnsi="Calibri"/>
-          <w:b/>
-          <w:color w:val="20808D"/>
-          <w:sz w:val="24"/>
-        </w:rPr>
-        <w:t>SS 2 - Kapitalerhoehung gegen Bareinlage (Seed-Runde)</w:t>
+        <w:t>Unterschriften</w:t>
       </w:r>
     </w:p>
     <w:p>
+      <w:pPr>
+        <w:spacing w:after="40"/>
+      </w:pPr>
       <w:r>
-        <w:rPr>
-          <w:rFonts w:ascii="Calibri" w:hAnsi="Calibri"/>
-          <w:b w:val="0"/>
-          <w:i w:val="0"/>
-          <w:color w:val="28251D"/>
-          <w:sz w:val="22"/>
-        </w:rPr>
-        <w:t>Das Stammkapital wird nach Eintragung der Kapitalerhoehung I (SS 1) weiter erhoeht von EUR 1007,00 um EUR 25,00 auf EUR 1032,00 durch Ausgabe von 25 neuen Geschaeftsanteilen im Nennbetrag von je EUR 1,00 gegen Bareinlage von EUR 1000000 (davon EUR 25,00 auf das Stammkapital, EUR 999975,00 in die Kapitalruecklage).</w:t>
-      </w:r>
-    </w:p>
-    <w:p/>
-    <w:p>
-      <w:r>
-        <w:rPr>
-          <w:rFonts w:ascii="Calibri" w:hAnsi="Calibri"/>
-          <w:b/>
-          <w:color w:val="20808D"/>
-          <w:sz w:val="24"/>
-        </w:rPr>
-        <w:t>SS 3 - ESOP-Reserve</w:t>
-      </w:r>
-    </w:p>
-    <w:p>
-      <w:r>
-        <w:rPr>
-          <w:rFonts w:ascii="Calibri" w:hAnsi="Calibri"/>
-          <w:b w:val="0"/>
-          <w:i w:val="0"/>
-          <w:color w:val="28251D"/>
-          <w:sz w:val="22"/>
-        </w:rPr>
-        <w:t>Die Gesellschafter stimmen der Schaffung einer ESOP-Reserve von drei (3) weiteren Anteilen zu. Die Ausgabe bedarf jeweils eines gesonderten Gesellschafterbeschlusses.</w:t>
-      </w:r>
-    </w:p>
-    <w:p/>
-    <w:p>
-      <w:r>
-        <w:rPr>
-          <w:rFonts w:ascii="Calibri" w:hAnsi="Calibri"/>
-          <w:b/>
-          <w:color w:val="20808D"/>
-          <w:sz w:val="24"/>
-        </w:rPr>
-        <w:t>SS 4 - Satzungsaenderung</w:t>
-      </w:r>
-    </w:p>
-    <w:p>
-      <w:r>
-        <w:rPr>
-          <w:rFonts w:ascii="Calibri" w:hAnsi="Calibri"/>
-          <w:b w:val="0"/>
-          <w:i w:val="0"/>
-          <w:color w:val="28251D"/>
-          <w:sz w:val="22"/>
-        </w:rPr>
-        <w:t>SS 3 der Satzung (Stammkapital) wird wie folgt neu gefasst: Das Stammkapital der Gesellschaft betraegt EUR [1032,00 / 1035,00 nach ESOP], eingeteilt in [Zahl] Geschaeftsanteile.</w:t>
+        <w:t>Berlin, 4. März 2027</w:t>
       </w:r>
     </w:p>
     <w:p/>
     <w:p>
       <w:pPr>
         <w:spacing w:after="40"/>
-        <w:pBdr>
-          <w:bottom w:val="single" w:sz="6" w:space="1" w:color="D4D1CA"/>
-        </w:pBdr>
       </w:pPr>
-    </w:p>
-    <w:p>
       <w:r>
-        <w:rPr>
-          <w:rFonts w:ascii="Calibri" w:hAnsi="Calibri"/>
-          <w:b/>
-          <w:color w:val="1B474D"/>
-          <w:sz w:val="24"/>
-        </w:rPr>
-        <w:t>Abstimmungsergebnis</w:t>
+        <w:t>_______________________________________</w:t>
       </w:r>
     </w:p>
     <w:p>
+      <w:pPr>
+        <w:spacing w:after="40"/>
+      </w:pPr>
       <w:r>
-        <w:rPr>
-          <w:rFonts w:ascii="Calibri" w:hAnsi="Calibri"/>
-          <w:b w:val="0"/>
-          <w:i w:val="0"/>
-          <w:color w:val="28251D"/>
-          <w:sz w:val="22"/>
-        </w:rPr>
-        <w:t>Ja-Stimmen: 75  |  Nein-Stimmen: 0  |  Enthaltungen: 0</w:t>
-      </w:r>
-    </w:p>
-    <w:p>
-      <w:r>
-        <w:rPr>
-          <w:rFonts w:ascii="Calibri" w:hAnsi="Calibri"/>
-          <w:b w:val="0"/>
-          <w:i/>
-          <w:color w:val="7A7974"/>
-          <w:sz w:val="20"/>
-        </w:rPr>
-        <w:t>Quorum: 100 % der stimmberechtigten Anteile anwesend. Beschluesse einstimmig gefasst.</w:t>
+        <w:t>Dr. Mira Schoeneck (Versammlungsleitung und Geschäftsführerin)</w:t>
       </w:r>
     </w:p>
     <w:p/>
     <w:p>
       <w:pPr>
         <w:spacing w:after="40"/>
-        <w:pBdr>
-          <w:bottom w:val="single" w:sz="6" w:space="1" w:color="D4D1CA"/>
-        </w:pBdr>
       </w:pPr>
-    </w:p>
-    <w:p>
       <w:r>
-        <w:rPr>
-          <w:rFonts w:ascii="Calibri" w:hAnsi="Calibri"/>
-          <w:b/>
-          <w:color w:val="1B474D"/>
-          <w:sz w:val="24"/>
-        </w:rPr>
-        <w:t>Beurkundungsvermerk</w:t>
+        <w:t>_______________________________________</w:t>
       </w:r>
     </w:p>
     <w:p>
+      <w:pPr>
+        <w:spacing w:after="40"/>
+      </w:pPr>
       <w:r>
-        <w:rPr>
-          <w:rFonts w:ascii="Calibri" w:hAnsi="Calibri"/>
-          <w:b w:val="0"/>
-          <w:i/>
-          <w:color w:val="7A7974"/>
-          <w:sz w:val="22"/>
-        </w:rPr>
-        <w:t>Diese Niederschrift bedarf der notariellen Beurkundung gemaess SS 55 Abs. 1 GmbHG i.V.m. SS 2 Abs. 1 GmbHG. Der Notar wird gebeten, die Beurkundung vorzunehmen und die Handelsregisteranmeldung gemaess SS 57 GmbHG zu beglaubigen.</w:t>
-      </w:r>
-    </w:p>
-    <w:p/>
-    <w:p/>
-    <w:p>
-      <w:r>
-        <w:rPr>
-          <w:rFonts w:ascii="Calibri" w:hAnsi="Calibri"/>
-          <w:b w:val="0"/>
-          <w:i/>
-          <w:color w:val="7A7974"/>
-          <w:sz w:val="22"/>
-        </w:rPr>
-        <w:t>Ort, Datum: Berlin, _______________</w:t>
+        <w:t>Lina Habersaat (Schriftführung)</w:t>
       </w:r>
     </w:p>
     <w:p/>
     <w:p>
+      <w:pPr>
+        <w:spacing w:after="40"/>
+      </w:pPr>
       <w:r>
-        <w:rPr>
-          <w:rFonts w:ascii="Calibri" w:hAnsi="Calibri"/>
-          <w:sz w:val="22"/>
-        </w:rPr>
-        <w:t>__________________________________________________</w:t>
+        <w:t>_______________________________________</w:t>
       </w:r>
     </w:p>
     <w:p>
+      <w:pPr>
+        <w:spacing w:after="40"/>
+      </w:pPr>
       <w:r>
-        <w:rPr>
-          <w:sz w:val="20"/>
-        </w:rPr>
-        <w:t>Dr. Mira Schoeneck (Vorsitzende der Gesellschafterversammlung / GF)</w:t>
-      </w:r>
-    </w:p>
-    <w:p/>
-    <w:p>
-      <w:r>
-        <w:rPr>
-          <w:rFonts w:ascii="Calibri" w:hAnsi="Calibri"/>
-          <w:sz w:val="22"/>
-        </w:rPr>
-        <w:t>__________________________________________________</w:t>
-      </w:r>
-    </w:p>
-    <w:p>
-      <w:r>
-        <w:rPr>
-          <w:sz w:val="20"/>
-        </w:rPr>
-        <w:t>Lina Habersaat (Gesellschafterin)</w:t>
-      </w:r>
-    </w:p>
-    <w:p/>
-    <w:p>
-      <w:r>
-        <w:rPr>
-          <w:rFonts w:ascii="Calibri" w:hAnsi="Calibri"/>
-          <w:sz w:val="22"/>
-        </w:rPr>
-        <w:t>__________________________________________________</w:t>
-      </w:r>
-    </w:p>
-    <w:p>
-      <w:r>
-        <w:rPr>
-          <w:sz w:val="20"/>
-        </w:rPr>
-        <w:t>Northstar Pre-Seed Partners GmbH &amp; Co. KG (Wandlungsglaeubigerin)</w:t>
+        <w:t>Notarin Dr. Eva Wendthusen (UR-Nr. 0142/2027 i.V.m. 0143 und 0144/2027)</w:t>
       </w:r>
     </w:p>
     <w:p/>
     <w:sectPr>
       <w:pgSz w:w="12240" w:h="15840"/>
-      <w:pgMar w:top="1417" w:right="1417" w:bottom="1417" w:left="1701" w:header="720" w:footer="720" w:gutter="0"/>
+      <w:pgMar w:top="1134" w:right="1134" w:bottom="1134" w:left="1134" w:header="720" w:footer="720" w:gutter="0"/>
       <w:cols w:space="720"/>
       <w:docGrid w:linePitch="360"/>
     </w:sectPr>
@@ -947,6 +760,10 @@
     <w:name w:val="Normal"/>
     <w:qFormat/>
     <w:rsid w:val="00FC693F"/>
+    <w:rPr>
+      <w:rFonts w:ascii="Calibri" w:hAnsi="Calibri"/>
+      <w:sz w:val="20"/>
+    </w:rPr>
   </w:style>
   <w:style w:type="paragraph" w:styleId="Header">
     <w:name w:val="header"/>

</xml_diff>